<commit_message>
fix: resize logo drawing slot for horizontal logo (was square)
The drawing slot was 0.89x0.88 inches (designed for old square logo).
New horizontal logo (4.35:1 ratio) was squished. Resized to 2.5x0.57 inches.

Generated with [Claude Code](https://claude.ai/code)
via [Happy](https://happy.engineering)

Co-Authored-By: Claude <noreply@anthropic.com>
Co-Authored-By: Happy <yesreply@happy.engineering>
</commit_message>
<xml_diff>
--- a/skills/docx/templates/onbehalfai/template-compte-rendu.docx
+++ b/skills/docx/templates/onbehalfai/template-compte-rendu.docx
@@ -104,8 +104,8 @@
               </w:rPr>
               <w:drawing>
                 <wp:inline distT="0" distB="0" distL="0" distR="0" wp14:anchorId="27ACA792" wp14:editId="25A55B8B">
-                  <wp:extent cx="816909" cy="800100"/>
-                  <wp:effectExtent l="0" t="0" r="2540" b="0"/>
+                  <wp:extent cx="2286000" cy="525517"/>
+                  <wp:effectExtent l="0" t="0" r="0" b="0"/>
                   <wp:docPr id="1001" name="Graphic 3"/>
                   <wp:cNvGraphicFramePr>
                     <a:graphicFrameLocks xmlns:a="http://schemas.openxmlformats.org/drawingml/2006/main" noChangeAspect="1"/>
@@ -120,10 +120,10 @@
                         <pic:blipFill>
                           <a:blip r:embed="rId12">
                             <a:extLst>
-                              <a:ext uri="{28A0092B-C50C-407E-A947-70E740481C1C}">
+                              <a:ext uri="{28A0092B-C50C-407E-A947-70E740481C1C}" cx="2286000" cy="525517">
                                 <a14:useLocalDpi xmlns:a14="http://schemas.microsoft.com/office/drawing/2010/main" val="0"/>
                               </a:ext>
-                              <a:ext uri="{96DAC541-7B7A-43D3-8B79-37D633B846F1}">
+                              <a:ext uri="{96DAC541-7B7A-43D3-8B79-37D633B846F1}" cx="2286000" cy="525517">
                                 <asvg:svgBlip xmlns:asvg="http://schemas.microsoft.com/office/drawing/2016/SVG/main" r:embed="rId13"/>
                               </a:ext>
                             </a:extLst>
@@ -135,7 +135,7 @@
                         <pic:spPr>
                           <a:xfrm>
                             <a:off x="0" y="0"/>
-                            <a:ext cx="822427" cy="805504"/>
+                            <a:ext cx="2286000" cy="525517"/>
                           </a:xfrm>
                           <a:prstGeom prst="rect">
                             <a:avLst/>

</xml_diff>

<commit_message>
fix: resize logo to 3.0x0.69 inches (fits 3.5-inch cell)
Previous 2.5-inch width was too wide and overflowed the right margin.
Cell is 3.5 inches; logo now 3.0 inches with margin.

Generated with [Claude Code](https://claude.ai/code)
via [Happy](https://happy.engineering)

Co-Authored-By: Claude <noreply@anthropic.com>
Co-Authored-By: Happy <yesreply@happy.engineering>
</commit_message>
<xml_diff>
--- a/skills/docx/templates/onbehalfai/template-compte-rendu.docx
+++ b/skills/docx/templates/onbehalfai/template-compte-rendu.docx
@@ -104,7 +104,7 @@
               </w:rPr>
               <w:drawing>
                 <wp:inline distT="0" distB="0" distL="0" distR="0" wp14:anchorId="27ACA792" wp14:editId="25A55B8B">
-                  <wp:extent cx="2286000" cy="525517"/>
+                  <wp:extent cx="2743200" cy="630620"/>
                   <wp:effectExtent l="0" t="0" r="0" b="0"/>
                   <wp:docPr id="1001" name="Graphic 3"/>
                   <wp:cNvGraphicFramePr>
@@ -120,10 +120,10 @@
                         <pic:blipFill>
                           <a:blip r:embed="rId12">
                             <a:extLst>
-                              <a:ext uri="{28A0092B-C50C-407E-A947-70E740481C1C}" cx="2286000" cy="525517">
+                              <a:ext uri="{28A0092B-C50C-407E-A947-70E740481C1C}" cx="2743200" cy="630620">
                                 <a14:useLocalDpi xmlns:a14="http://schemas.microsoft.com/office/drawing/2010/main" val="0"/>
                               </a:ext>
-                              <a:ext uri="{96DAC541-7B7A-43D3-8B79-37D633B846F1}" cx="2286000" cy="525517">
+                              <a:ext uri="{96DAC541-7B7A-43D3-8B79-37D633B846F1}" cx="2743200" cy="630620">
                                 <asvg:svgBlip xmlns:asvg="http://schemas.microsoft.com/office/drawing/2016/SVG/main" r:embed="rId13"/>
                               </a:ext>
                             </a:extLst>
@@ -135,7 +135,7 @@
                         <pic:spPr>
                           <a:xfrm>
                             <a:off x="0" y="0"/>
-                            <a:ext cx="2286000" cy="525517"/>
+                            <a:ext cx="2743200" cy="630620"/>
                           </a:xfrm>
                           <a:prstGeom prst="rect">
                             <a:avLst/>

</xml_diff>

<commit_message>
fix: logo dimensions from user's manual fix (1.80x0.41 inches)
Applied exact dimensions from user's corrected v4bis:
- wp:extent: 1647542x378745 EMU (1.80x0.41")
- a:xfrm: 1699459x390680 EMU (1.86x0.43")
- Cleared hardcoded dimensions from SVG extension elements
- effectExtent bottom: 2540 EMU

Generated with [Claude Code](https://claude.ai/code)
via [Happy](https://happy.engineering)

Co-Authored-By: Claude <noreply@anthropic.com>
Co-Authored-By: Happy <yesreply@happy.engineering>
</commit_message>
<xml_diff>
--- a/skills/docx/templates/onbehalfai/template-compte-rendu.docx
+++ b/skills/docx/templates/onbehalfai/template-compte-rendu.docx
@@ -104,8 +104,8 @@
               </w:rPr>
               <w:drawing>
                 <wp:inline distT="0" distB="0" distL="0" distR="0" wp14:anchorId="27ACA792" wp14:editId="25A55B8B">
-                  <wp:extent cx="2743200" cy="630620"/>
-                  <wp:effectExtent l="0" t="0" r="0" b="0"/>
+                  <wp:extent cx="1647542" cy="378745"/>
+                  <wp:effectExtent l="0" t="0" r="0" b="2540"/>
                   <wp:docPr id="1001" name="Graphic 3"/>
                   <wp:cNvGraphicFramePr>
                     <a:graphicFrameLocks xmlns:a="http://schemas.openxmlformats.org/drawingml/2006/main" noChangeAspect="1"/>
@@ -120,10 +120,10 @@
                         <pic:blipFill>
                           <a:blip r:embed="rId12">
                             <a:extLst>
-                              <a:ext uri="{28A0092B-C50C-407E-A947-70E740481C1C}" cx="2743200" cy="630620">
+                              <a:ext uri="{28A0092B-C50C-407E-A947-70E740481C1C}">
                                 <a14:useLocalDpi xmlns:a14="http://schemas.microsoft.com/office/drawing/2010/main" val="0"/>
                               </a:ext>
-                              <a:ext uri="{96DAC541-7B7A-43D3-8B79-37D633B846F1}" cx="2743200" cy="630620">
+                              <a:ext uri="{96DAC541-7B7A-43D3-8B79-37D633B846F1}">
                                 <asvg:svgBlip xmlns:asvg="http://schemas.microsoft.com/office/drawing/2016/SVG/main" r:embed="rId13"/>
                               </a:ext>
                             </a:extLst>
@@ -135,7 +135,7 @@
                         <pic:spPr>
                           <a:xfrm>
                             <a:off x="0" y="0"/>
-                            <a:ext cx="2743200" cy="630620"/>
+                            <a:ext cx="1699459" cy="390680"/>
                           </a:xfrm>
                           <a:prstGeom prst="rect">
                             <a:avLst/>

</xml_diff>